<commit_message>
Creazione teoria - fix
</commit_message>
<xml_diff>
--- a/agente-creazione-teoria/outputs/reflusso-gastrico/Mappa_Reflusso_Gastroesofageo.docx
+++ b/agente-creazione-teoria/outputs/reflusso-gastrico/Mappa_Reflusso_Gastroesofageo.docx
@@ -10,7 +10,7 @@
         <w:t xml:space="preserve">Mobilitas — Direzione Osteopatica</w:t>
       </w:r>
     </w:p>
-    <w:bookmarkStart w:id="15" w:name="X51ac31ddcca6f65152ae1fad3198e813be3f14e"/>
+    <w:bookmarkStart w:id="16" w:name="X51ac31ddcca6f65152ae1fad3198e813be3f14e"/>
     <w:p>
       <w:pPr>
         <w:pStyle w:val="Heading1"/>
@@ -44,13 +44,13 @@
           <w:b/>
           <w:bCs/>
         </w:rPr>
-        <w:t xml:space="preserve">Ancora:</w:t>
-      </w:r>
-      <w:r>
-        <w:t xml:space="preserve"> </w:t>
-      </w:r>
-      <w:r>
-        <w:t xml:space="preserve">Ángel Oliva-Pascual-Vaca (terapia manuale) · Ravinder K. Mittal (fisiologia) —</w:t>
+        <w:t xml:space="preserve">Ancora clinica:</w:t>
+      </w:r>
+      <w:r>
+        <w:t xml:space="preserve"> </w:t>
+      </w:r>
+      <w:r>
+        <w:t xml:space="preserve">Ángel Oliva-Pascual-Vaca ·</w:t>
       </w:r>
       <w:r>
         <w:t xml:space="preserve"> </w:t>
@@ -60,13 +60,29 @@
           <w:b/>
           <w:bCs/>
         </w:rPr>
-        <w:t xml:space="preserve">v6.0 finale</w:t>
-      </w:r>
-      <w:r>
-        <w:t xml:space="preserve"> </w:t>
-      </w:r>
-      <w:r>
-        <w:t xml:space="preserve">— agosto 2026</w:t>
+        <w:t xml:space="preserve">Ancora fisiologica:</w:t>
+      </w:r>
+      <w:r>
+        <w:t xml:space="preserve"> </w:t>
+      </w:r>
+      <w:r>
+        <w:t xml:space="preserve">Ravinder K. Mittal —</w:t>
+      </w:r>
+      <w:r>
+        <w:t xml:space="preserve"> </w:t>
+      </w:r>
+      <w:r>
+        <w:rPr>
+          <w:b/>
+          <w:bCs/>
+        </w:rPr>
+        <w:t xml:space="preserve">v7.0 finale</w:t>
+      </w:r>
+      <w:r>
+        <w:t xml:space="preserve"> </w:t>
+      </w:r>
+      <w:r>
+        <w:t xml:space="preserve">· agosto 2026</w:t>
       </w:r>
     </w:p>
     <w:p>
@@ -90,19 +106,19 @@
         <w:pStyle w:val="FirstParagraph"/>
       </w:pPr>
       <w:r>
-        <w:t xml:space="preserve">È una malattia della barriera, non dell’acido: il contenuto dello stomaco risale nell’esofago e produce sintomi o danno alla mucosa.</w:t>
-      </w:r>
-      <w:r>
-        <w:t xml:space="preserve"> </w:t>
-      </w:r>
-      <w:r>
-        <w:t xml:space="preserve">Prevalenza globale 13,98%, cioè circa un miliardo di persone. Fra chi assume un inibitore di pompa i sintomi persistono nel 17-32% negli studi clinici, e fino al 45% negli studi osservazionali.</w:t>
-      </w:r>
-      <w:r>
-        <w:t xml:space="preserve"> </w:t>
-      </w:r>
-      <w:r>
-        <w:t xml:space="preserve">È cronica e fluttuante. Nei trial il placebo vale il 18,85%: ogni miglioramento va letto con questo metro.</w:t>
+        <w:t xml:space="preserve">Il contenuto dello stomaco risale nell’esofago e produce sintomi o danno alla mucosa: è una malattia della barriera, non dell’acido.</w:t>
+      </w:r>
+      <w:r>
+        <w:t xml:space="preserve"> </w:t>
+      </w:r>
+      <w:r>
+        <w:t xml:space="preserve">Riguarda circa il 14% della popolazione mondiale. Fra chi prende un inibitore di pompa il bruciore persiste nel 17-32% negli studi clinici e nel 45% in medicina generale.</w:t>
+      </w:r>
+      <w:r>
+        <w:t xml:space="preserve"> </w:t>
+      </w:r>
+      <w:r>
+        <w:t xml:space="preserve">È cronica e fluttuante: nei trial il placebo vale il 18,85%, ma la remissione spontanea è solo il 2,32% l’anno. Oscilla molto, guarisce poco.</w:t>
       </w:r>
     </w:p>
     <w:p>
@@ -113,13 +129,13 @@
       </w:r>
     </w:p>
     <w:bookmarkEnd w:id="9"/>
-    <w:bookmarkStart w:id="10" w:name="X683a141d583d4f0b2cf152eaafaab3da7d59e8d"/>
+    <w:bookmarkStart w:id="10" w:name="la-catena-causale"/>
     <w:p>
       <w:pPr>
         <w:pStyle w:val="Heading2"/>
       </w:pPr>
       <w:r>
-        <w:t xml:space="preserve">2 · La catena causale — il meccanismo principale, quello senza leva manuale</w:t>
+        <w:t xml:space="preserve">2 · La catena causale</w:t>
       </w:r>
     </w:p>
     <w:p>
@@ -127,7 +143,10 @@
         <w:pStyle w:val="FirstParagraph"/>
       </w:pPr>
       <w:r>
-        <w:t xml:space="preserve">pasto abbondante → distensione del fondo gastrico → riflesso vagale che rilascia il LES + inibizione centrale che spegne il crus → i due sfinteri restano aperti insieme → il contenuto passa e resta a contatto → bruciore, rigurgito, tosse, nodo in gola</w:t>
+        <w:rPr>
+          <w:rStyle w:val="VerbatimChar"/>
+        </w:rPr>
+        <w:t xml:space="preserve">pasto o pressione addominale ↑ → distensione del fondo gastrico → riflesso vago-vagale che apre insieme LES e crus (inibizione selettiva del solo crus) → barriera aperta con liquido sopra → risalita e contatto con la mucosa → bruciore, rigurgito, tosse notturna</w:t>
       </w:r>
     </w:p>
     <w:p>
@@ -205,18 +224,18 @@
               <w:pStyle w:val="Compact"/>
             </w:pPr>
             <w:r>
-              <w:t xml:space="preserve">Rilasciamenti transitori</w:t>
-            </w:r>
-          </w:p>
-        </w:tc>
-        <w:tc>
-          <w:tcPr/>
-          <w:p>
-            <w:pPr>
-              <w:pStyle w:val="Compact"/>
-            </w:pPr>
-            <w:r>
-              <w:t xml:space="preserve">Sintomo post-prandiale, eruttazioni, sazietà precoce</w:t>
+              <w:t xml:space="preserve">Rilasciamento transitorio</w:t>
+            </w:r>
+          </w:p>
+        </w:tc>
+        <w:tc>
+          <w:tcPr/>
+          <w:p>
+            <w:pPr>
+              <w:pStyle w:val="Compact"/>
+            </w:pPr>
+            <w:r>
+              <w:t xml:space="preserve">Solo dopo i pasti, eruttazioni</w:t>
             </w:r>
           </w:p>
         </w:tc>
@@ -251,7 +270,7 @@
               <w:pStyle w:val="Compact"/>
             </w:pPr>
             <w:r>
-              <w:t xml:space="preserve">Rigurgito da sdraiato, ernia a referto</w:t>
+              <w:t xml:space="preserve">Rigurgito, ernia a referto</w:t>
             </w:r>
           </w:p>
         </w:tc>
@@ -286,7 +305,7 @@
               <w:pStyle w:val="Compact"/>
             </w:pPr>
             <w:r>
-              <w:t xml:space="preserve">Referto pulito, farmaco inefficace</w:t>
+              <w:t xml:space="preserve">Segue lo stato emotivo, a dieta invariata</w:t>
             </w:r>
           </w:p>
         </w:tc>
@@ -310,29 +329,29 @@
               <w:pStyle w:val="Compact"/>
             </w:pPr>
             <w:r>
-              <w:t xml:space="preserve">Gradiente pressorio addominale</w:t>
-            </w:r>
-          </w:p>
-        </w:tc>
-        <w:tc>
-          <w:tcPr/>
-          <w:p>
-            <w:pPr>
-              <w:pStyle w:val="Compact"/>
-            </w:pPr>
-            <w:r>
-              <w:t xml:space="preserve">Peggiora piegandosi, addome teso</w:t>
-            </w:r>
-          </w:p>
-        </w:tc>
-        <w:tc>
-          <w:tcPr/>
-          <w:p>
-            <w:pPr>
-              <w:pStyle w:val="Compact"/>
-            </w:pPr>
-            <w:r>
-              <w:t xml:space="preserve">PROBABILE</w:t>
+              <w:t xml:space="preserve">Pressione dal contenitore</w:t>
+            </w:r>
+          </w:p>
+        </w:tc>
+        <w:tc>
+          <w:tcPr/>
+          <w:p>
+            <w:pPr>
+              <w:pStyle w:val="Compact"/>
+            </w:pPr>
+            <w:r>
+              <w:t xml:space="preserve">Peggiora piegandosi, cintura stretta</w:t>
+            </w:r>
+          </w:p>
+        </w:tc>
+        <w:tc>
+          <w:tcPr/>
+          <w:p>
+            <w:pPr>
+              <w:pStyle w:val="Compact"/>
+            </w:pPr>
+            <w:r>
+              <w:t xml:space="preserve">DIMOSTRATO</w:t>
             </w:r>
           </w:p>
         </w:tc>
@@ -408,6 +427,65 @@
         </w:tc>
       </w:tr>
     </w:tbl>
+    <w:p>
+      <w:pPr>
+        <w:pStyle w:val="BodyText"/>
+      </w:pPr>
+      <w:r>
+        <w:t xml:space="preserve">Le etichette valgono per il</w:t>
+      </w:r>
+      <w:r>
+        <w:t xml:space="preserve"> </w:t>
+      </w:r>
+      <w:r>
+        <w:rPr>
+          <w:b/>
+          <w:bCs/>
+        </w:rPr>
+        <w:t xml:space="preserve">meccanismo</w:t>
+      </w:r>
+      <w:r>
+        <w:t xml:space="preserve">. La</w:t>
+      </w:r>
+      <w:r>
+        <w:t xml:space="preserve"> </w:t>
+      </w:r>
+      <w:r>
+        <w:rPr>
+          <w:b/>
+          <w:bCs/>
+        </w:rPr>
+        <w:t xml:space="preserve">leva manuale</w:t>
+      </w:r>
+      <w:r>
+        <w:t xml:space="preserve"> </w:t>
+      </w:r>
+      <w:r>
+        <w:t xml:space="preserve">su quel meccanismo non sale mai con loro. Sulla pressione e sulla percezione resta IPOTESI. Sul crus è PROBABILE solo per l’effetto immediato — e il crus è un bersaglio, non una causa dimostrata.</w:t>
+      </w:r>
+      <w:r>
+        <w:t xml:space="preserve"> </w:t>
+      </w:r>
+      <w:r>
+        <w:t xml:space="preserve">Le mani hanno una leva solo sul terzo, sul quarto e sul quinto. E le leve con le prove migliori non sono manuali.</w:t>
+      </w:r>
+      <w:r>
+        <w:t xml:space="preserve"> </w:t>
+      </w:r>
+      <w:r>
+        <w:rPr>
+          <w:b/>
+          <w:bCs/>
+        </w:rPr>
+        <w:t xml:space="preserve">I tre limiti da dire ad alta voce:</w:t>
+      </w:r>
+      <w:r>
+        <w:t xml:space="preserve"> </w:t>
+      </w:r>
+      <w:r>
+        <w:t xml:space="preserve">non si riduce un’ernia con le mani; non si riduce l’esposizione acida, mai misurata dopo trattamento manuale; non si tocca la terapia farmacologica.</w:t>
+      </w:r>
+    </w:p>
     <w:p>
       <w:r>
         <w:pict>
@@ -494,7 +572,7 @@
               <w:pStyle w:val="Compact"/>
             </w:pPr>
             <w:r>
-              <w:t xml:space="preserve">Conta il volume, non il cibo</w:t>
+              <w:t xml:space="preserve">Legato al volume, non al cibo</w:t>
             </w:r>
           </w:p>
         </w:tc>
@@ -518,29 +596,29 @@
               <w:pStyle w:val="Compact"/>
             </w:pPr>
             <w:r>
-              <w:t xml:space="preserve">Pressorio-posturale</w:t>
-            </w:r>
-          </w:p>
-        </w:tc>
-        <w:tc>
-          <w:tcPr/>
-          <w:p>
-            <w:pPr>
-              <w:pStyle w:val="Compact"/>
-            </w:pPr>
-            <w:r>
-              <w:t xml:space="preserve">Peggiora piegandosi, anche a stomaco vuoto</w:t>
-            </w:r>
-          </w:p>
-        </w:tc>
-        <w:tc>
-          <w:tcPr/>
-          <w:p>
-            <w:pPr>
-              <w:pStyle w:val="Compact"/>
-            </w:pPr>
-            <w:r>
-              <w:t xml:space="preserve">Abbastanza</w:t>
+              <w:t xml:space="preserve">A svuotamento lento</w:t>
+            </w:r>
+          </w:p>
+        </w:tc>
+        <w:tc>
+          <w:tcPr/>
+          <w:p>
+            <w:pPr>
+              <w:pStyle w:val="Compact"/>
+            </w:pPr>
+            <w:r>
+              <w:t xml:space="preserve">Sazietà precoce, pienezza che dura</w:t>
+            </w:r>
+          </w:p>
+        </w:tc>
+        <w:tc>
+          <w:tcPr/>
+          <w:p>
+            <w:pPr>
+              <w:pStyle w:val="Compact"/>
+            </w:pPr>
+            <w:r>
+              <w:t xml:space="preserve">Poco: si segnala</w:t>
             </w:r>
           </w:p>
         </w:tc>
@@ -553,29 +631,29 @@
               <w:pStyle w:val="Compact"/>
             </w:pPr>
             <w:r>
-              <w:t xml:space="preserve">Diaframmatico</w:t>
-            </w:r>
-          </w:p>
-        </w:tc>
-        <w:tc>
-          <w:tcPr/>
-          <w:p>
-            <w:pPr>
-              <w:pStyle w:val="Compact"/>
-            </w:pPr>
-            <w:r>
-              <w:t xml:space="preserve">Carico e rigidità toracica, non a stomaco vuoto</w:t>
-            </w:r>
-          </w:p>
-        </w:tc>
-        <w:tc>
-          <w:tcPr/>
-          <w:p>
-            <w:pPr>
-              <w:pStyle w:val="Compact"/>
-            </w:pPr>
-            <w:r>
-              <w:t xml:space="preserve">Abbastanza</w:t>
+              <w:t xml:space="preserve">Pressorio-posturale</w:t>
+            </w:r>
+          </w:p>
+        </w:tc>
+        <w:tc>
+          <w:tcPr/>
+          <w:p>
+            <w:pPr>
+              <w:pStyle w:val="Compact"/>
+            </w:pPr>
+            <w:r>
+              <w:t xml:space="preserve">Peggiora piegandosi, anche a digiuno</w:t>
+            </w:r>
+          </w:p>
+        </w:tc>
+        <w:tc>
+          <w:tcPr/>
+          <w:p>
+            <w:pPr>
+              <w:pStyle w:val="Compact"/>
+            </w:pPr>
+            <w:r>
+              <w:t xml:space="preserve">Abbastanza (leva IPOTESI)</w:t>
             </w:r>
           </w:p>
         </w:tc>
@@ -588,18 +666,18 @@
               <w:pStyle w:val="Compact"/>
             </w:pPr>
             <w:r>
-              <w:t xml:space="preserve">Sproporzionato al referto</w:t>
-            </w:r>
-          </w:p>
-        </w:tc>
-        <w:tc>
-          <w:tcPr/>
-          <w:p>
-            <w:pPr>
-              <w:pStyle w:val="Compact"/>
-            </w:pPr>
-            <w:r>
-              <w:t xml:space="preserve">Sintomo segue lo stato emotivo</w:t>
+              <w:t xml:space="preserve">Diaframmatico</w:t>
+            </w:r>
+          </w:p>
+        </w:tc>
+        <w:tc>
+          <w:tcPr/>
+          <w:p>
+            <w:pPr>
+              <w:pStyle w:val="Compact"/>
+            </w:pPr>
+            <w:r>
+              <w:t xml:space="preserve">Respiro alto, torace chiuso</w:t>
             </w:r>
           </w:p>
         </w:tc>
@@ -623,29 +701,29 @@
               <w:pStyle w:val="Compact"/>
             </w:pPr>
             <w:r>
-              <w:t xml:space="preserve">Notturno-extraesofageo</w:t>
-            </w:r>
-          </w:p>
-        </w:tc>
-        <w:tc>
-          <w:tcPr/>
-          <w:p>
-            <w:pPr>
-              <w:pStyle w:val="Compact"/>
-            </w:pPr>
-            <w:r>
-              <w:t xml:space="preserve">Tosse, disfonia, nodo in gola</w:t>
-            </w:r>
-          </w:p>
-        </w:tc>
-        <w:tc>
-          <w:tcPr/>
-          <w:p>
-            <w:pPr>
-              <w:pStyle w:val="Compact"/>
-            </w:pPr>
-            <w:r>
-              <w:t xml:space="preserve">Poco</w:t>
+              <w:t xml:space="preserve">Sproporzionato al referto</w:t>
+            </w:r>
+          </w:p>
+        </w:tc>
+        <w:tc>
+          <w:tcPr/>
+          <w:p>
+            <w:pPr>
+              <w:pStyle w:val="Compact"/>
+            </w:pPr>
+            <w:r>
+              <w:t xml:space="preserve">Segue lo stato emotivo</w:t>
+            </w:r>
+          </w:p>
+        </w:tc>
+        <w:tc>
+          <w:tcPr/>
+          <w:p>
+            <w:pPr>
+              <w:pStyle w:val="Compact"/>
+            </w:pPr>
+            <w:r>
+              <w:t xml:space="preserve">Abbastanza</w:t>
             </w:r>
           </w:p>
         </w:tc>
@@ -658,6 +736,41 @@
               <w:pStyle w:val="Compact"/>
             </w:pPr>
             <w:r>
+              <w:t xml:space="preserve">Notturno-extraesofageo</w:t>
+            </w:r>
+          </w:p>
+        </w:tc>
+        <w:tc>
+          <w:tcPr/>
+          <w:p>
+            <w:pPr>
+              <w:pStyle w:val="Compact"/>
+            </w:pPr>
+            <w:r>
+              <w:t xml:space="preserve">Tosse, voce, nodo in gola</w:t>
+            </w:r>
+          </w:p>
+        </w:tc>
+        <w:tc>
+          <w:tcPr/>
+          <w:p>
+            <w:pPr>
+              <w:pStyle w:val="Compact"/>
+            </w:pPr>
+            <w:r>
+              <w:t xml:space="preserve">Poco</w:t>
+            </w:r>
+          </w:p>
+        </w:tc>
+      </w:tr>
+      <w:tr>
+        <w:tc>
+          <w:tcPr/>
+          <w:p>
+            <w:pPr>
+              <w:pStyle w:val="Compact"/>
+            </w:pPr>
+            <w:r>
               <w:t xml:space="preserve">Strutturale-erosivo</w:t>
             </w:r>
           </w:p>
@@ -669,23 +782,70 @@
               <w:pStyle w:val="Compact"/>
             </w:pPr>
             <w:r>
-              <w:t xml:space="preserve">Ernia voluminosa, esofagite, Barrett</w:t>
-            </w:r>
-          </w:p>
-        </w:tc>
-        <w:tc>
-          <w:tcPr/>
-          <w:p>
-            <w:pPr>
-              <w:pStyle w:val="Compact"/>
-            </w:pPr>
-            <w:r>
-              <w:t xml:space="preserve">Niente: invio</w:t>
+              <w:t xml:space="preserve">Ernia grande, esofagite, Barrett</w:t>
+            </w:r>
+          </w:p>
+        </w:tc>
+        <w:tc>
+          <w:tcPr/>
+          <w:p>
+            <w:pPr>
+              <w:pStyle w:val="Compact"/>
+            </w:pPr>
+            <w:r>
+              <w:t xml:space="preserve">Poco: invio</w:t>
             </w:r>
           </w:p>
         </w:tc>
       </w:tr>
     </w:tbl>
+    <w:p>
+      <w:pPr>
+        <w:pStyle w:val="BodyText"/>
+      </w:pPr>
+      <w:r>
+        <w:t xml:space="preserve">Tre domande separano i quattro più frequenti:</w:t>
+      </w:r>
+      <w:r>
+        <w:t xml:space="preserve"> </w:t>
+      </w:r>
+      <w:r>
+        <w:rPr>
+          <w:i/>
+          <w:iCs/>
+        </w:rPr>
+        <w:t xml:space="preserve">“peggiora per quanto mangi o per quando ti pieghi?”</w:t>
+      </w:r>
+      <w:r>
+        <w:t xml:space="preserve">,</w:t>
+      </w:r>
+      <w:r>
+        <w:t xml:space="preserve"> </w:t>
+      </w:r>
+      <w:r>
+        <w:rPr>
+          <w:i/>
+          <w:iCs/>
+        </w:rPr>
+        <w:t xml:space="preserve">“succede anche a stomaco vuoto?”</w:t>
+      </w:r>
+      <w:r>
+        <w:t xml:space="preserve">,</w:t>
+      </w:r>
+      <w:r>
+        <w:t xml:space="preserve"> </w:t>
+      </w:r>
+      <w:r>
+        <w:rPr>
+          <w:i/>
+          <w:iCs/>
+        </w:rPr>
+        <w:t xml:space="preserve">“ti senti pieno a lungo dopo mangiato?”</w:t>
+      </w:r>
+      <w:r>
+        <w:t xml:space="preserve">.</w:t>
+      </w:r>
+    </w:p>
     <w:p>
       <w:r>
         <w:pict>
@@ -694,13 +854,264 @@
       </w:r>
     </w:p>
     <w:bookmarkEnd w:id="12"/>
-    <w:bookmarkStart w:id="13" w:name="le-bandiere-rosse"/>
+    <w:bookmarkStart w:id="13" w:name="Xe92089a6dd609d2c9aa8399af4945e43c491082"/>
     <w:p>
       <w:pPr>
         <w:pStyle w:val="Heading2"/>
       </w:pPr>
       <w:r>
-        <w:t xml:space="preserve">5 · Le bandiere rosse</w:t>
+        <w:t xml:space="preserve">5 · Cosa fa il paziente da solo — le leve con le prove migliori</w:t>
+      </w:r>
+    </w:p>
+    <w:tbl>
+      <w:tblPr>
+        <w:tblStyle w:val="Table"/>
+        <w:tblW w:type="pct" w:w="5000"/>
+        <w:tblLayout w:type="fixed"/>
+        <w:tblLook w:firstRow="1" w:lastRow="0" w:firstColumn="0" w:lastColumn="0" w:noHBand="0" w:noVBand="0" w:val="0020"/>
+      </w:tblPr>
+      <w:tblGrid>
+        <w:gridCol w:w="2640"/>
+        <w:gridCol w:w="2640"/>
+        <w:gridCol w:w="2640"/>
+      </w:tblGrid>
+      <w:tr>
+        <w:trPr>
+          <w:tblHeader w:val="on"/>
+        </w:trPr>
+        <w:tc>
+          <w:tcPr/>
+          <w:p>
+            <w:pPr>
+              <w:pStyle w:val="Compact"/>
+            </w:pPr>
+            <w:r>
+              <w:t xml:space="preserve">Strumento</w:t>
+            </w:r>
+          </w:p>
+        </w:tc>
+        <w:tc>
+          <w:tcPr/>
+          <w:p>
+            <w:pPr>
+              <w:pStyle w:val="Compact"/>
+            </w:pPr>
+            <w:r>
+              <w:t xml:space="preserve">Su quale meccanismo</w:t>
+            </w:r>
+          </w:p>
+        </w:tc>
+        <w:tc>
+          <w:tcPr/>
+          <w:p>
+            <w:pPr>
+              <w:pStyle w:val="Compact"/>
+            </w:pPr>
+            <w:r>
+              <w:t xml:space="preserve">Quanto è solido</w:t>
+            </w:r>
+          </w:p>
+        </w:tc>
+      </w:tr>
+      <w:tr>
+        <w:tc>
+          <w:tcPr/>
+          <w:p>
+            <w:pPr>
+              <w:pStyle w:val="Compact"/>
+            </w:pPr>
+            <w:r>
+              <w:t xml:space="preserve">Esercizio respiratorio diaframmatico</w:t>
+            </w:r>
+          </w:p>
+        </w:tc>
+        <w:tc>
+          <w:tcPr/>
+          <w:p>
+            <w:pPr>
+              <w:pStyle w:val="Compact"/>
+            </w:pPr>
+            <w:r>
+              <w:t xml:space="preserve">Contributo crurale, forse i rilasciamenti</w:t>
+            </w:r>
+          </w:p>
+        </w:tc>
+        <w:tc>
+          <w:tcPr/>
+          <w:p>
+            <w:pPr>
+              <w:pStyle w:val="Compact"/>
+            </w:pPr>
+            <w:r>
+              <w:t xml:space="preserve">PROBABILE forte</w:t>
+            </w:r>
+          </w:p>
+        </w:tc>
+      </w:tr>
+      <w:tr>
+        <w:tc>
+          <w:tcPr/>
+          <w:p>
+            <w:pPr>
+              <w:pStyle w:val="Compact"/>
+            </w:pPr>
+            <w:r>
+              <w:t xml:space="preserve">Peso corporeo</w:t>
+            </w:r>
+          </w:p>
+        </w:tc>
+        <w:tc>
+          <w:tcPr/>
+          <w:p>
+            <w:pPr>
+              <w:pStyle w:val="Compact"/>
+            </w:pPr>
+            <w:r>
+              <w:t xml:space="preserve">Pressione dal contenitore</w:t>
+            </w:r>
+          </w:p>
+        </w:tc>
+        <w:tc>
+          <w:tcPr/>
+          <w:p>
+            <w:pPr>
+              <w:pStyle w:val="Compact"/>
+            </w:pPr>
+            <w:r>
+              <w:t xml:space="preserve">DIMOSTRATO</w:t>
+            </w:r>
+          </w:p>
+        </w:tc>
+      </w:tr>
+      <w:tr>
+        <w:tc>
+          <w:tcPr/>
+          <w:p>
+            <w:pPr>
+              <w:pStyle w:val="Compact"/>
+            </w:pPr>
+            <w:r>
+              <w:t xml:space="preserve">Posizione notturna sul fianco sinistro</w:t>
+            </w:r>
+          </w:p>
+        </w:tc>
+        <w:tc>
+          <w:tcPr/>
+          <w:p>
+            <w:pPr>
+              <w:pStyle w:val="Compact"/>
+            </w:pPr>
+            <w:r>
+              <w:t xml:space="preserve">Clearance notturna</w:t>
+            </w:r>
+          </w:p>
+        </w:tc>
+        <w:tc>
+          <w:tcPr/>
+          <w:p>
+            <w:pPr>
+              <w:pStyle w:val="Compact"/>
+            </w:pPr>
+            <w:r>
+              <w:t xml:space="preserve">DIMOSTRATO</w:t>
+            </w:r>
+          </w:p>
+        </w:tc>
+      </w:tr>
+      <w:tr>
+        <w:tc>
+          <w:tcPr/>
+          <w:p>
+            <w:pPr>
+              <w:pStyle w:val="Compact"/>
+            </w:pPr>
+            <w:r>
+              <w:t xml:space="preserve">Togliere cintura e indumenti compressivi</w:t>
+            </w:r>
+          </w:p>
+        </w:tc>
+        <w:tc>
+          <w:tcPr/>
+          <w:p>
+            <w:pPr>
+              <w:pStyle w:val="Compact"/>
+            </w:pPr>
+            <w:r>
+              <w:t xml:space="preserve">Pressione dal contenitore</w:t>
+            </w:r>
+          </w:p>
+        </w:tc>
+        <w:tc>
+          <w:tcPr/>
+          <w:p>
+            <w:pPr>
+              <w:pStyle w:val="Compact"/>
+            </w:pPr>
+            <w:r>
+              <w:t xml:space="preserve">PROBABILE</w:t>
+            </w:r>
+          </w:p>
+        </w:tc>
+      </w:tr>
+      <w:tr>
+        <w:tc>
+          <w:tcPr/>
+          <w:p>
+            <w:pPr>
+              <w:pStyle w:val="Compact"/>
+            </w:pPr>
+            <w:r>
+              <w:t xml:space="preserve">Testata del letto alzata, non il cuscino</w:t>
+            </w:r>
+          </w:p>
+        </w:tc>
+        <w:tc>
+          <w:tcPr/>
+          <w:p>
+            <w:pPr>
+              <w:pStyle w:val="Compact"/>
+            </w:pPr>
+            <w:r>
+              <w:t xml:space="preserve">Clearance notturna</w:t>
+            </w:r>
+          </w:p>
+        </w:tc>
+        <w:tc>
+          <w:tcPr/>
+          <w:p>
+            <w:pPr>
+              <w:pStyle w:val="Compact"/>
+            </w:pPr>
+            <w:r>
+              <w:t xml:space="preserve">PROBABILE</w:t>
+            </w:r>
+          </w:p>
+        </w:tc>
+      </w:tr>
+    </w:tbl>
+    <w:p>
+      <w:pPr>
+        <w:pStyle w:val="BodyText"/>
+      </w:pPr>
+      <w:r>
+        <w:t xml:space="preserve">Il guadagno appartiene alla ripetizione: chi smette torna dov’era. La testata alzata ha eventi avversi nel 54%.</w:t>
+      </w:r>
+    </w:p>
+    <w:p>
+      <w:r>
+        <w:pict>
+          <v:rect style="width:0;height:1.5pt" o:hralign="center" o:hrstd="t" o:hr="t"/>
+        </w:pict>
+      </w:r>
+    </w:p>
+    <w:bookmarkEnd w:id="13"/>
+    <w:bookmarkStart w:id="14" w:name="le-bandiere-rosse"/>
+    <w:p>
+      <w:pPr>
+        <w:pStyle w:val="Heading2"/>
+      </w:pPr>
+      <w:r>
+        <w:t xml:space="preserve">6 · Le bandiere rosse</w:t>
       </w:r>
     </w:p>
     <w:p>
@@ -712,7 +1123,23 @@
         </w:numPr>
       </w:pPr>
       <w:r>
-        <w:t xml:space="preserve">Dolore toracico sotto sforzo, sudorazione, affanno → pronto soccorso → immediata</w:t>
+        <w:t xml:space="preserve">Dolore toracico sotto sforzo, sudorazione, affanno →</w:t>
+      </w:r>
+      <w:r>
+        <w:t xml:space="preserve"> </w:t>
+      </w:r>
+      <w:r>
+        <w:rPr>
+          <w:b/>
+          <w:bCs/>
+        </w:rPr>
+        <w:t xml:space="preserve">pronto soccorso</w:t>
+      </w:r>
+      <w:r>
+        <w:t xml:space="preserve"> </w:t>
+      </w:r>
+      <w:r>
+        <w:t xml:space="preserve">→ immediata</w:t>
       </w:r>
     </w:p>
     <w:p>
@@ -724,7 +1151,23 @@
         </w:numPr>
       </w:pPr>
       <w:r>
-        <w:t xml:space="preserve">Vomito con sangue o feci nere → pronto soccorso → immediata</w:t>
+        <w:t xml:space="preserve">Vomito con sangue, feci nere →</w:t>
+      </w:r>
+      <w:r>
+        <w:t xml:space="preserve"> </w:t>
+      </w:r>
+      <w:r>
+        <w:rPr>
+          <w:b/>
+          <w:bCs/>
+        </w:rPr>
+        <w:t xml:space="preserve">pronto soccorso</w:t>
+      </w:r>
+      <w:r>
+        <w:t xml:space="preserve"> </w:t>
+      </w:r>
+      <w:r>
+        <w:t xml:space="preserve">→ immediata</w:t>
       </w:r>
     </w:p>
     <w:p>
@@ -736,7 +1179,23 @@
         </w:numPr>
       </w:pPr>
       <w:r>
-        <w:t xml:space="preserve">Epigastralgia in terzo trimestre, non bruciante → ostetrico → immediata</w:t>
+        <w:t xml:space="preserve">Dolore epigastrico in terzo trimestre →</w:t>
+      </w:r>
+      <w:r>
+        <w:t xml:space="preserve"> </w:t>
+      </w:r>
+      <w:r>
+        <w:rPr>
+          <w:b/>
+          <w:bCs/>
+        </w:rPr>
+        <w:t xml:space="preserve">ostetrico</w:t>
+      </w:r>
+      <w:r>
+        <w:t xml:space="preserve"> </w:t>
+      </w:r>
+      <w:r>
+        <w:t xml:space="preserve">→ immediata</w:t>
       </w:r>
     </w:p>
     <w:p>
@@ -748,7 +1207,23 @@
         </w:numPr>
       </w:pPr>
       <w:r>
-        <w:t xml:space="preserve">Difficoltà o dolore a deglutire (disfagia, odinofagia) → gastroenterologo → giorni</w:t>
+        <w:t xml:space="preserve">Massa pulsante con dolore addominale o lombare →</w:t>
+      </w:r>
+      <w:r>
+        <w:t xml:space="preserve"> </w:t>
+      </w:r>
+      <w:r>
+        <w:rPr>
+          <w:b/>
+          <w:bCs/>
+        </w:rPr>
+        <w:t xml:space="preserve">pronto soccorso</w:t>
+      </w:r>
+      <w:r>
+        <w:t xml:space="preserve"> </w:t>
+      </w:r>
+      <w:r>
+        <w:t xml:space="preserve">→ immediata</w:t>
       </w:r>
     </w:p>
     <w:p>
@@ -760,7 +1235,23 @@
         </w:numPr>
       </w:pPr>
       <w:r>
-        <w:t xml:space="preserve">Calo di peso involontario → medico di base → giorni</w:t>
+        <w:t xml:space="preserve">Massa addominale pulsante isolata →</w:t>
+      </w:r>
+      <w:r>
+        <w:t xml:space="preserve"> </w:t>
+      </w:r>
+      <w:r>
+        <w:rPr>
+          <w:b/>
+          <w:bCs/>
+        </w:rPr>
+        <w:t xml:space="preserve">ecografia dell’aorta</w:t>
+      </w:r>
+      <w:r>
+        <w:t xml:space="preserve"> </w:t>
+      </w:r>
+      <w:r>
+        <w:t xml:space="preserve">→ giorni</w:t>
       </w:r>
     </w:p>
     <w:p>
@@ -772,7 +1263,17 @@
         </w:numPr>
       </w:pPr>
       <w:r>
-        <w:t xml:space="preserve">Vomito ripetuto che non si ferma → medico di base → giorni</w:t>
+        <w:t xml:space="preserve">Vomito ripetuto che non si ferma → medico di base →</w:t>
+      </w:r>
+      <w:r>
+        <w:t xml:space="preserve"> </w:t>
+      </w:r>
+      <w:r>
+        <w:rPr>
+          <w:b/>
+          <w:bCs/>
+        </w:rPr>
+        <w:t xml:space="preserve">in giornata</w:t>
       </w:r>
     </w:p>
     <w:p>
@@ -784,7 +1285,23 @@
         </w:numPr>
       </w:pPr>
       <w:r>
-        <w:t xml:space="preserve">Massa addominale pulsante, o dolore profondo persistente → medico di base → prima del ciclo</w:t>
+        <w:t xml:space="preserve">Difficoltà o dolore a deglutire →</w:t>
+      </w:r>
+      <w:r>
+        <w:t xml:space="preserve"> </w:t>
+      </w:r>
+      <w:r>
+        <w:rPr>
+          <w:b/>
+          <w:bCs/>
+        </w:rPr>
+        <w:t xml:space="preserve">gastroenterologo</w:t>
+      </w:r>
+      <w:r>
+        <w:t xml:space="preserve"> </w:t>
+      </w:r>
+      <w:r>
+        <w:t xml:space="preserve">→ giorni</w:t>
       </w:r>
     </w:p>
     <w:p>
@@ -796,7 +1313,7 @@
         </w:numPr>
       </w:pPr>
       <w:r>
-        <w:t xml:space="preserve">Raucedine o disfonia oltre tre settimane → otorinolaringoiatra → prima del ciclo</w:t>
+        <w:t xml:space="preserve">Calo di peso involontario → medico di base → giorni</w:t>
       </w:r>
     </w:p>
     <w:p>
@@ -808,7 +1325,23 @@
         </w:numPr>
       </w:pPr>
       <w:r>
-        <w:t xml:space="preserve">Sintomi nuovi dopo i 50 anni · anemia o astenia → medico di base → prima del ciclo</w:t>
+        <w:t xml:space="preserve">Voce roca oltre tre settimane →</w:t>
+      </w:r>
+      <w:r>
+        <w:t xml:space="preserve"> </w:t>
+      </w:r>
+      <w:r>
+        <w:rPr>
+          <w:b/>
+          <w:bCs/>
+        </w:rPr>
+        <w:t xml:space="preserve">otorinolaringoiatra</w:t>
+      </w:r>
+      <w:r>
+        <w:t xml:space="preserve"> </w:t>
+      </w:r>
+      <w:r>
+        <w:t xml:space="preserve">→ prima del ciclo</w:t>
       </w:r>
     </w:p>
     <w:p>
@@ -820,7 +1353,137 @@
         </w:numPr>
       </w:pPr>
       <w:r>
-        <w:t xml:space="preserve">Bruciore epigastrico nuovo in donna, over-65, diabetico, nefropatico — anche senza sforzo, senza irradiazione, e anche se l’antiacido dà sollievo → pronto soccorso → immediata</w:t>
+        <w:t xml:space="preserve">Sintomi nuovi dopo i 50 anni → medico di base → prima del ciclo</w:t>
+      </w:r>
+    </w:p>
+    <w:p>
+      <w:pPr>
+        <w:pStyle w:val="Compact"/>
+        <w:numPr>
+          <w:ilvl w:val="0"/>
+          <w:numId w:val="1001"/>
+        </w:numPr>
+      </w:pPr>
+      <w:r>
+        <w:t xml:space="preserve">Anemia o stanchezza ingiustificata → medico di base → prima del ciclo</w:t>
+      </w:r>
+    </w:p>
+    <w:p>
+      <w:pPr>
+        <w:pStyle w:val="FirstParagraph"/>
+      </w:pPr>
+      <w:r>
+        <w:t xml:space="preserve">In donne, over-65, diabetici e nefropatici il filtro cardiaco classico fallisce: un bruciore epigastrico isolato è cardiaco fino a prova contraria.</w:t>
+      </w:r>
+      <w:r>
+        <w:t xml:space="preserve"> </w:t>
+      </w:r>
+      <w:r>
+        <w:t xml:space="preserve">Nel paziente in anticoagulante o antiaggregante, melena e anemia scendono di un livello di urgenza.</w:t>
+      </w:r>
+    </w:p>
+    <w:p>
+      <w:pPr>
+        <w:pStyle w:val="BodyText"/>
+      </w:pPr>
+      <w:r>
+        <w:rPr>
+          <w:b/>
+          <w:bCs/>
+        </w:rPr>
+        <w:t xml:space="preserve">Le zone che non si premono</w:t>
+      </w:r>
+    </w:p>
+    <w:p>
+      <w:pPr>
+        <w:pStyle w:val="Compact"/>
+        <w:numPr>
+          <w:ilvl w:val="0"/>
+          <w:numId w:val="1002"/>
+        </w:numPr>
+      </w:pPr>
+      <w:r>
+        <w:rPr>
+          <w:b/>
+          <w:bCs/>
+        </w:rPr>
+        <w:t xml:space="preserve">Collo anteriore</w:t>
+      </w:r>
+      <w:r>
+        <w:t xml:space="preserve">, fra osso ioide e cartilagine tiroidea: guaina carotidea e biforcazione. Non è una leva.</w:t>
+      </w:r>
+    </w:p>
+    <w:p>
+      <w:pPr>
+        <w:pStyle w:val="Compact"/>
+        <w:numPr>
+          <w:ilvl w:val="0"/>
+          <w:numId w:val="1002"/>
+        </w:numPr>
+      </w:pPr>
+      <w:r>
+        <w:rPr>
+          <w:b/>
+          <w:bCs/>
+        </w:rPr>
+        <w:t xml:space="preserve">Epigastrio e ipocondrio destro in terzo trimestre</w:t>
+      </w:r>
+      <w:r>
+        <w:t xml:space="preserve">: è la sede del segno di preeclampsia e HELLP.</w:t>
+      </w:r>
+    </w:p>
+    <w:p>
+      <w:pPr>
+        <w:pStyle w:val="Compact"/>
+        <w:numPr>
+          <w:ilvl w:val="0"/>
+          <w:numId w:val="1002"/>
+        </w:numPr>
+      </w:pPr>
+      <w:r>
+        <w:rPr>
+          <w:b/>
+          <w:bCs/>
+        </w:rPr>
+        <w:t xml:space="preserve">Addome operato di fresco</w:t>
+      </w:r>
+      <w:r>
+        <w:t xml:space="preserve">, e qualunque</w:t>
+      </w:r>
+      <w:r>
+        <w:t xml:space="preserve"> </w:t>
+      </w:r>
+      <w:r>
+        <w:rPr>
+          <w:b/>
+          <w:bCs/>
+        </w:rPr>
+        <w:t xml:space="preserve">pulsazione espansiva in epigastrio</w:t>
+      </w:r>
+      <w:r>
+        <w:t xml:space="preserve">: la seduta si interrompe.</w:t>
+      </w:r>
+    </w:p>
+    <w:p>
+      <w:pPr>
+        <w:pStyle w:val="Compact"/>
+        <w:numPr>
+          <w:ilvl w:val="0"/>
+          <w:numId w:val="1002"/>
+        </w:numPr>
+      </w:pPr>
+      <w:r>
+        <w:rPr>
+          <w:b/>
+          <w:bCs/>
+        </w:rPr>
+        <w:t xml:space="preserve">Gabbia toracica bassa e cerniera dorso-lombare</w:t>
+      </w:r>
+      <w:r>
+        <w:t xml:space="preserve"> </w:t>
+      </w:r>
+      <w:r>
+        <w:t xml:space="preserve">di un paziente in inibitore di pompa da anni: densità ossea ridotta finché non è escluso.</w:t>
       </w:r>
     </w:p>
     <w:p>
@@ -830,14 +1493,14 @@
         </w:pict>
       </w:r>
     </w:p>
-    <w:bookmarkEnd w:id="13"/>
-    <w:bookmarkStart w:id="14" w:name="la-frase-per-il-paziente"/>
+    <w:bookmarkEnd w:id="14"/>
+    <w:bookmarkStart w:id="15" w:name="la-frase-per-il-paziente"/>
     <w:p>
       <w:pPr>
         <w:pStyle w:val="Heading2"/>
       </w:pPr>
       <w:r>
-        <w:t xml:space="preserve">6 · La frase per il paziente</w:t>
+        <w:t xml:space="preserve">7 · La frase per il paziente</w:t>
       </w:r>
     </w:p>
     <w:p>
@@ -852,8 +1515,45 @@
         <w:t xml:space="preserve">“Non conta quanto è stretto il tappo del tubetto: conta quanto stringi il tubo.”</w:t>
       </w:r>
     </w:p>
-    <w:bookmarkEnd w:id="14"/>
+    <w:p>
+      <w:r>
+        <w:pict>
+          <v:rect style="width:0;height:1.5pt" o:hralign="center" o:hrstd="t" o:hr="t"/>
+        </w:pict>
+      </w:r>
+    </w:p>
+    <w:p>
+      <w:pPr>
+        <w:pStyle w:val="BlockText"/>
+      </w:pPr>
+      <w:r>
+        <w:rPr>
+          <w:b/>
+          <w:bCs/>
+        </w:rPr>
+        <w:t xml:space="preserve">Nota di struttura.</w:t>
+      </w:r>
+      <w:r>
+        <w:t xml:space="preserve"> </w:t>
+      </w:r>
+      <w:r>
+        <w:t xml:space="preserve">Il blocco 5 è il settimo blocco condizionale previsto per le condizioni in cui il Capitolo 12 della Bibbia è attivo. È una deviazione dichiarata da</w:t>
+      </w:r>
+      <w:r>
+        <w:t xml:space="preserve"> </w:t>
+      </w:r>
+      <w:r>
+        <w:rPr>
+          <w:rStyle w:val="VerbatimChar"/>
+        </w:rPr>
+        <w:t xml:space="preserve">mappa-concettuale.md</w:t>
+      </w:r>
+      <w:r>
+        <w:t xml:space="preserve">, registrata come D-011.</w:t>
+      </w:r>
+    </w:p>
     <w:bookmarkEnd w:id="15"/>
+    <w:bookmarkEnd w:id="16"/>
     <w:sectPr>
       <w:footnotePr>
         <w:numRestart w:val="eachSect"/>
@@ -1071,6 +1771,9 @@
     <w:abstractNumId w:val="990"/>
   </w:num>
   <w:num w:numId="1001">
+    <w:abstractNumId w:val="991"/>
+  </w:num>
+  <w:num w:numId="1002">
     <w:abstractNumId w:val="991"/>
   </w:num>
 </w:numbering>

</xml_diff>